<commit_message>
Fixed most bugs from @Onyia's PR
Add runtime_paths.py to backend and frontend directories

- Created runtime_paths.py in both the backend and frontend directories to manage file paths dynamically.
- Implemented a function to determine the base directory based on the execution context (normal vs PyInstaller bundle).
- Defined constants for asset directories and important file paths (e.g., scenarios, sounds, images, fonts, keybinds, and database).
</commit_message>
<xml_diff>
--- a/what-remains-one-pager.docx
+++ b/what-remains-one-pager.docx
@@ -19,7 +19,14 @@
         <w:spacing w:after="80"/>
       </w:pPr>
       <w:r>
-        <w:t>What Remains? — Theme: Waste and the Environment. Inspired by an untitled scrap metal bull sculpture at the Yemisi Shyllon Museum of Art, built entirely from discarded electronics.</w:t>
+        <w:rPr>
+          <w:i/>
+          <w:iCs/>
+        </w:rPr>
+        <w:t xml:space="preserve">What Remains? </w:t>
+      </w:r>
+      <w:r>
+        <w:t>Theme: Waste and the Environment. Inspired by an untitled scrap metal bull sculpture at the Yemisi Shyllon Museum of Art, built entirely from discarded electronics.</w:t>
       </w:r>
     </w:p>
     <w:p>
@@ -39,7 +46,23 @@
         <w:spacing w:after="80"/>
       </w:pPr>
       <w:r>
-        <w:t>Electronic waste is the fastest-growing waste stream in the world, yet most environmental awareness efforts fail to create genuine emotional engagement — they inform without transforming. The distance between knowing about environmental destruction and personally feeling implicated by it is rarely bridged. What Remains? addresses this by placing the player inside the consequences of waste, rather than presenting statistics about them.</w:t>
+        <w:t>Electronic waste is the fastest-growing waste stream in the world, yet most environmental awareness efforts fail to create genuine emotional engagement</w:t>
+      </w:r>
+      <w:r>
+        <w:t xml:space="preserve">; </w:t>
+      </w:r>
+      <w:r>
+        <w:t xml:space="preserve">they inform without transforming. The distance between knowing about environmental destruction and personally feeling implicated by it is rarely bridged. </w:t>
+      </w:r>
+      <w:r>
+        <w:rPr>
+          <w:i/>
+          <w:iCs/>
+        </w:rPr>
+        <w:t>What Remains?</w:t>
+      </w:r>
+      <w:r>
+        <w:t xml:space="preserve"> addresses this by placing the player inside the consequences of waste, rather than presenting statistics about them.</w:t>
       </w:r>
     </w:p>
     <w:p>
@@ -59,7 +82,26 @@
         <w:spacing w:after="80"/>
       </w:pPr>
       <w:r>
-        <w:t>What Remains? is a narrative choices game in which the player makes a series of environmental decisions that affect a city's health score, culminating in one of three distinct endings. The application is designed for students and young adults aged 16 to 28 who grew up surrounded by electronic devices and may not have considered their relationship to e-waste. By connecting gameplay choices to real environmental consequences — and grounding the experience in a real artwork — the game creates emotional proximity to a problem that is usually experienced as abstract.</w:t>
+        <w:rPr>
+          <w:i/>
+          <w:iCs/>
+        </w:rPr>
+        <w:t>What Remains?</w:t>
+      </w:r>
+      <w:r>
+        <w:t xml:space="preserve"> is a narrative choices game in which the player makes a series of environmental decisions that affect a city's health score, culminating in one of three distinct endings. The application is designed for students and young adults aged 16 to 28 who grew up surrounded by electronic devices and may not have considered their relationship to e-waste. By connecting gameplay choices to real environmental consequences</w:t>
+      </w:r>
+      <w:r>
+        <w:t xml:space="preserve"> </w:t>
+      </w:r>
+      <w:r>
+        <w:t>and grounding the experience in a real artwork</w:t>
+      </w:r>
+      <w:r>
+        <w:t xml:space="preserve">, </w:t>
+      </w:r>
+      <w:r>
+        <w:t>the game creates emotional proximity to a problem that is usually experienced as abstract.</w:t>
       </w:r>
     </w:p>
     <w:p>
@@ -120,11 +162,9 @@
         </w:numPr>
         <w:spacing w:after="40"/>
       </w:pPr>
-      <w:proofErr w:type="spellStart"/>
       <w:r>
         <w:t>Tkinter</w:t>
       </w:r>
-      <w:proofErr w:type="spellEnd"/>
       <w:r>
         <w:t>: G</w:t>
       </w:r>
@@ -166,11 +206,9 @@
         </w:numPr>
         <w:spacing w:after="40"/>
       </w:pPr>
-      <w:proofErr w:type="spellStart"/>
       <w:r>
         <w:t>supabase-py</w:t>
       </w:r>
-      <w:proofErr w:type="spellEnd"/>
       <w:r>
         <w:t>: G</w:t>
       </w:r>
@@ -187,11 +225,9 @@
         </w:numPr>
         <w:spacing w:after="40"/>
       </w:pPr>
-      <w:proofErr w:type="spellStart"/>
       <w:r>
         <w:t>bcrypt</w:t>
       </w:r>
-      <w:proofErr w:type="spellEnd"/>
       <w:r>
         <w:t>: P</w:t>
       </w:r>
@@ -208,11 +244,9 @@
         </w:numPr>
         <w:spacing w:after="40"/>
       </w:pPr>
-      <w:proofErr w:type="spellStart"/>
       <w:r>
         <w:t>pygame-ce</w:t>
       </w:r>
-      <w:proofErr w:type="spellEnd"/>
       <w:r>
         <w:t>: A</w:t>
       </w:r>
@@ -249,13 +283,8 @@
         <w:spacing w:after="40"/>
       </w:pPr>
       <w:r>
-        <w:t>python-</w:t>
-      </w:r>
-      <w:proofErr w:type="spellStart"/>
-      <w:r>
-        <w:t>dotenv</w:t>
-      </w:r>
-      <w:proofErr w:type="spellEnd"/>
+        <w:t>python-dotenv</w:t>
+      </w:r>
       <w:r>
         <w:t>: E</w:t>
       </w:r>
@@ -272,21 +301,8 @@
         </w:numPr>
         <w:spacing w:after="40"/>
       </w:pPr>
-      <w:proofErr w:type="spellStart"/>
-      <w:r>
-        <w:t>pathlib</w:t>
-      </w:r>
-      <w:proofErr w:type="spellEnd"/>
-      <w:r>
-        <w:t xml:space="preserve">, </w:t>
-      </w:r>
-      <w:proofErr w:type="spellStart"/>
-      <w:r>
-        <w:t>json</w:t>
-      </w:r>
-      <w:proofErr w:type="spellEnd"/>
-      <w:r>
-        <w:t>, logging</w:t>
+      <w:r>
+        <w:t>pathlib, json, logging</w:t>
       </w:r>
       <w:r>
         <w:t>: F</w:t>
@@ -294,11 +310,9 @@
       <w:r>
         <w:t xml:space="preserve">ile handling, </w:t>
       </w:r>
-      <w:proofErr w:type="spellStart"/>
-      <w:r>
-        <w:t>keybind</w:t>
-      </w:r>
-      <w:proofErr w:type="spellEnd"/>
+      <w:r>
+        <w:t>key binds</w:t>
+      </w:r>
       <w:r>
         <w:t xml:space="preserve"> storage, and application logging</w:t>
       </w:r>
@@ -312,13 +326,8 @@
         </w:numPr>
         <w:spacing w:after="80"/>
       </w:pPr>
-      <w:proofErr w:type="spellStart"/>
-      <w:r>
-        <w:t>getpass</w:t>
-      </w:r>
-      <w:proofErr w:type="spellEnd"/>
-      <w:r>
-        <w:t>: User account details</w:t>
+      <w:r>
+        <w:t>getpass: User account details</w:t>
       </w:r>
     </w:p>
     <w:p>
@@ -357,58 +366,13 @@
         <w:t xml:space="preserve">Oluwasemire Ajayi (25120111007): </w:t>
       </w:r>
       <w:r>
-        <w:t xml:space="preserve">Built the SQLite database layer (Database class with </w:t>
-      </w:r>
-      <w:proofErr w:type="spellStart"/>
-      <w:r>
-        <w:t>save_run</w:t>
-      </w:r>
-      <w:proofErr w:type="spellEnd"/>
-      <w:r>
-        <w:t xml:space="preserve">, </w:t>
-      </w:r>
-      <w:proofErr w:type="spellStart"/>
-      <w:r>
-        <w:t>save_choice</w:t>
-      </w:r>
-      <w:proofErr w:type="spellEnd"/>
-      <w:r>
-        <w:t xml:space="preserve">, </w:t>
-      </w:r>
-      <w:proofErr w:type="spellStart"/>
-      <w:r>
-        <w:t>get_local_top_scores</w:t>
-      </w:r>
-      <w:proofErr w:type="spellEnd"/>
-      <w:r>
-        <w:t xml:space="preserve"> methods), the </w:t>
-      </w:r>
-      <w:proofErr w:type="spellStart"/>
-      <w:r>
-        <w:t>Supabase</w:t>
-      </w:r>
-      <w:proofErr w:type="spellEnd"/>
-      <w:r>
-        <w:t xml:space="preserve"> leaderboard integration, local login and signup authentication with </w:t>
-      </w:r>
-      <w:proofErr w:type="spellStart"/>
-      <w:r>
-        <w:t>bcrypt</w:t>
-      </w:r>
-      <w:proofErr w:type="spellEnd"/>
-      <w:r>
-        <w:t xml:space="preserve"> password hashing, the </w:t>
-      </w:r>
-      <w:proofErr w:type="spellStart"/>
-      <w:r>
-        <w:t>pygame-ce</w:t>
-      </w:r>
-      <w:proofErr w:type="spellEnd"/>
-      <w:r>
-        <w:t xml:space="preserve"> audio and input handling system, the splash screen UI, and the main application controller in main.py.</w:t>
-      </w:r>
-      <w:r>
-        <w:t xml:space="preserve"> Built the signup handler, game logic class with scenario loading from CSV and score calculation, and the end screen UI.</w:t>
+        <w:t xml:space="preserve">Designed and implemented the SQLite database layer, Supabase leaderboard integration, authentication system using bcrypt, pygame-ce audio/input handling, splash screen UI, main application controller (main.py), signup handler, and </w:t>
+      </w:r>
+      <w:r>
+        <w:t>key bind</w:t>
+      </w:r>
+      <w:r>
+        <w:t xml:space="preserve"> system.</w:t>
       </w:r>
     </w:p>
     <w:p>
@@ -420,90 +384,119 @@
           <w:b/>
           <w:bCs/>
         </w:rPr>
-        <w:t xml:space="preserve">Kamsiyochi </w:t>
-      </w:r>
-      <w:proofErr w:type="spellStart"/>
+        <w:t xml:space="preserve">Chianugo Onyia (25120111049): </w:t>
+      </w:r>
+      <w:r>
+        <w:t>Handled error handling in database.py, built the gameplay viewport, and implemented key binds for player movement.</w:t>
+      </w:r>
+    </w:p>
+    <w:p>
+      <w:pPr>
+        <w:spacing w:after="60"/>
+      </w:pPr>
       <w:r>
         <w:rPr>
           <w:b/>
           <w:bCs/>
         </w:rPr>
-        <w:t>Ekenulo</w:t>
-      </w:r>
-      <w:proofErr w:type="spellEnd"/>
+        <w:t xml:space="preserve">Kamsiyochi Ekenulo (25120111020): </w:t>
+      </w:r>
+      <w:r>
+        <w:t>Added audio management methods in logic.py using pygame for music and sound effects.</w:t>
+      </w:r>
+    </w:p>
+    <w:p>
+      <w:pPr>
+        <w:spacing w:after="60"/>
+      </w:pPr>
       <w:r>
         <w:rPr>
           <w:b/>
           <w:bCs/>
         </w:rPr>
-        <w:t xml:space="preserve"> (25120111020): </w:t>
-      </w:r>
-    </w:p>
-    <w:p>
-      <w:pPr>
-        <w:spacing w:after="60"/>
-      </w:pPr>
+        <w:t>Joseph Nnabueze (</w:t>
+      </w:r>
       <w:r>
         <w:rPr>
           <w:b/>
           <w:bCs/>
         </w:rPr>
-        <w:t xml:space="preserve">Joseph Nnabueze ([MATRIC NUMBER]): </w:t>
-      </w:r>
-    </w:p>
-    <w:p>
-      <w:pPr>
-        <w:spacing w:after="60"/>
-      </w:pPr>
-      <w:proofErr w:type="spellStart"/>
+        <w:t>25120111031</w:t>
+      </w:r>
       <w:r>
         <w:rPr>
           <w:b/>
           <w:bCs/>
         </w:rPr>
-        <w:t>Chianugo</w:t>
-      </w:r>
-      <w:proofErr w:type="spellEnd"/>
+        <w:t xml:space="preserve">): </w:t>
+      </w:r>
+      <w:r>
+        <w:t xml:space="preserve">Developed main-menu.py and the three ending screens; created </w:t>
+      </w:r>
+      <w:r>
+        <w:t xml:space="preserve">main menu </w:t>
+      </w:r>
+      <w:r>
+        <w:t>UI designs in Figma.</w:t>
+      </w:r>
+    </w:p>
+    <w:p>
+      <w:pPr>
+        <w:spacing w:after="60"/>
+      </w:pPr>
       <w:r>
         <w:rPr>
           <w:b/>
           <w:bCs/>
         </w:rPr>
-        <w:t xml:space="preserve"> Onyia ([MATRIC NUMBER]): </w:t>
-      </w:r>
-      <w:r>
-        <w:t>Implemented error handling in database.py</w:t>
-      </w:r>
-    </w:p>
-    <w:p>
-      <w:pPr>
-        <w:spacing w:after="60"/>
-      </w:pPr>
+        <w:t xml:space="preserve">Chimdike Agugoesi (25120111005): </w:t>
+      </w:r>
+      <w:r>
+        <w:t>Led the Figma design team.</w:t>
+      </w:r>
       <w:r>
         <w:rPr>
           <w:b/>
           <w:bCs/>
         </w:rPr>
-        <w:t xml:space="preserve">Chimdike </w:t>
-      </w:r>
-      <w:proofErr w:type="spellStart"/>
+        <w:t xml:space="preserve"> </w:t>
+      </w:r>
+      <w:r>
+        <w:t xml:space="preserve">Built the leaderboard frontend </w:t>
+      </w:r>
+      <w:r>
+        <w:t>implemented the</w:t>
+      </w:r>
+      <w:r>
+        <w:t xml:space="preserve"> Leaderboard class</w:t>
+      </w:r>
+      <w:r>
+        <w:t xml:space="preserve"> from the backend</w:t>
+      </w:r>
+      <w:r>
+        <w:t>; wrote game narration content.</w:t>
+      </w:r>
+    </w:p>
+    <w:p>
+      <w:pPr>
+        <w:spacing w:after="60"/>
+      </w:pPr>
       <w:r>
         <w:rPr>
           <w:b/>
           <w:bCs/>
         </w:rPr>
-        <w:t>Agugoesi</w:t>
-      </w:r>
-      <w:proofErr w:type="spellEnd"/>
+        <w:t>Marvelous Moses-Okorie (25120111029):</w:t>
+      </w:r>
       <w:r>
         <w:rPr>
           <w:b/>
           <w:bCs/>
         </w:rPr>
-        <w:t xml:space="preserve"> ([MATRIC NUMBER]): </w:t>
-      </w:r>
-      <w:r>
-        <w:t>Led the Figma design system, built the act intro screen with typewriter animation, and produced screen wireframes and the high-fidelity prototype.</w:t>
+        <w:t xml:space="preserve"> </w:t>
+      </w:r>
+      <w:r>
+        <w:t>Created prelude frames shown at the start of a new game.</w:t>
       </w:r>
     </w:p>
     <w:p>
@@ -515,25 +508,22 @@
           <w:b/>
           <w:bCs/>
         </w:rPr>
-        <w:t>Marvelous Moses-Okorie ([MATRIC NUMBER]):</w:t>
-      </w:r>
-    </w:p>
-    <w:p>
-      <w:pPr>
-        <w:spacing w:after="60"/>
-      </w:pPr>
-      <w:r>
-        <w:rPr>
-          <w:b/>
-          <w:bCs/>
-        </w:rPr>
-        <w:t xml:space="preserve">Osinachi Justin-Sonde ([MATRIC NUMBER]): </w:t>
-      </w:r>
-    </w:p>
-    <w:p>
-      <w:pPr>
-        <w:spacing w:after="60"/>
-      </w:pPr>
+        <w:t xml:space="preserve">Osinachi Justin-Sonde (25120111026): </w:t>
+      </w:r>
+      <w:r>
+        <w:t>Implemented pause screen and settings.py with key bind save/load functionality.</w:t>
+      </w:r>
+      <w:r>
+        <w:t xml:space="preserve"> Assisted in </w:t>
+      </w:r>
+      <w:proofErr w:type="spellStart"/>
+      <w:r>
+        <w:t>figma</w:t>
+      </w:r>
+      <w:proofErr w:type="spellEnd"/>
+      <w:r>
+        <w:t xml:space="preserve"> designs</w:t>
+      </w:r>
     </w:p>
     <w:sectPr>
       <w:type w:val="continuous"/>
@@ -635,13 +625,31 @@
     <w:pPr>
       <w:spacing w:after="80"/>
       <w:jc w:val="center"/>
+      <w:rPr>
+        <w:b/>
+        <w:bCs/>
+      </w:rPr>
     </w:pPr>
     <w:r>
       <w:rPr>
         <w:b/>
         <w:bCs/>
       </w:rPr>
-      <w:t>What Remains? — Project Summary</w:t>
+      <w:t xml:space="preserve">What </w:t>
+    </w:r>
+    <w:r>
+      <w:rPr>
+        <w:b/>
+        <w:bCs/>
+      </w:rPr>
+      <w:t xml:space="preserve">Remains? </w:t>
+    </w:r>
+    <w:r>
+      <w:rPr>
+        <w:b/>
+        <w:bCs/>
+      </w:rPr>
+      <w:t>Project Summary</w:t>
     </w:r>
   </w:p>
   <w:p>
@@ -813,6 +821,18 @@
     <w:lvlOverride w:ilvl="0">
       <w:startOverride w:val="1"/>
     </w:lvlOverride>
+  </w:num>
+  <w:num w:numId="3" w16cid:durableId="1608343302">
+    <w:abstractNumId w:val="0"/>
+    <w:lvlOverride w:ilvl="0"/>
+    <w:lvlOverride w:ilvl="1"/>
+    <w:lvlOverride w:ilvl="2"/>
+    <w:lvlOverride w:ilvl="3"/>
+    <w:lvlOverride w:ilvl="4"/>
+    <w:lvlOverride w:ilvl="5"/>
+    <w:lvlOverride w:ilvl="6"/>
+    <w:lvlOverride w:ilvl="7"/>
+    <w:lvlOverride w:ilvl="8"/>
   </w:num>
 </w:numbering>
 </file>
@@ -1211,6 +1231,7 @@
   <w:style w:type="paragraph" w:default="1" w:styleId="Normal">
     <w:name w:val="Normal"/>
     <w:qFormat/>
+    <w:rsid w:val="00F0377F"/>
   </w:style>
   <w:style w:type="paragraph" w:styleId="Heading1">
     <w:name w:val="heading 1"/>
@@ -1299,7 +1320,6 @@
   <w:style w:type="character" w:default="1" w:styleId="DefaultParagraphFont">
     <w:name w:val="Default Paragraph Font"/>
     <w:uiPriority w:val="1"/>
-    <w:semiHidden/>
     <w:unhideWhenUsed/>
   </w:style>
   <w:style w:type="table" w:default="1" w:styleId="TableNormal">

</xml_diff>

<commit_message>
Refine problem statement and solution summary in the one-pager document for clarity and emotional engagement
</commit_message>
<xml_diff>
--- a/what-remains-one-pager.docx
+++ b/what-remains-one-pager.docx
@@ -26,18 +26,25 @@
         <w:t xml:space="preserve">What Remains? </w:t>
       </w:r>
       <w:r>
-        <w:t>Theme: Waste and the Environment. Inspired by an untitled scrap metal bull sculpture at the Yemisi Shyllon Museum of Art, built entirely from discarded electronics.</w:t>
-      </w:r>
-    </w:p>
-    <w:p>
-      <w:pPr>
-        <w:spacing w:before="120" w:after="40"/>
-      </w:pPr>
-      <w:r>
         <w:rPr>
           <w:b/>
           <w:bCs/>
         </w:rPr>
+        <w:t>Theme</w:t>
+      </w:r>
+      <w:r>
+        <w:t>: Waste and the Environment. Inspired by an untitled scrap metal bull sculpture at the Yemisi Shyllon Museum of Art, built entirely from discarded electronics.</w:t>
+      </w:r>
+    </w:p>
+    <w:p>
+      <w:pPr>
+        <w:spacing w:before="120" w:after="40"/>
+      </w:pPr>
+      <w:r>
+        <w:rPr>
+          <w:b/>
+          <w:bCs/>
+        </w:rPr>
         <w:t>Problem Statement</w:t>
       </w:r>
     </w:p>
@@ -52,8 +59,16 @@
         <w:t xml:space="preserve">; </w:t>
       </w:r>
       <w:r>
-        <w:t xml:space="preserve">they inform without transforming. The distance between knowing about environmental destruction and personally feeling implicated by it is rarely bridged. </w:t>
-      </w:r>
+        <w:t xml:space="preserve">they inform without transforming. </w:t>
+      </w:r>
+      <w:r>
+        <w:t>Many people may know of the destruction of the planet and its resources, but most people do not feel the emotion associated with such knowledge.</w:t>
+      </w:r>
+    </w:p>
+    <w:p>
+      <w:pPr>
+        <w:spacing w:after="80"/>
+      </w:pPr>
       <w:r>
         <w:rPr>
           <w:i/>
@@ -79,29 +94,21 @@
     </w:p>
     <w:p>
       <w:pPr>
-        <w:spacing w:after="80"/>
-      </w:pPr>
-      <w:r>
+        <w:spacing w:before="120" w:after="40"/>
         <w:rPr>
           <w:i/>
           <w:iCs/>
         </w:rPr>
-        <w:t>What Remains?</w:t>
-      </w:r>
-      <w:r>
-        <w:t xml:space="preserve"> is a narrative choices game in which the player makes a series of environmental decisions that affect a city's health score, culminating in one of three distinct endings. The application is designed for students and young adults aged 16 to 28 who grew up surrounded by electronic devices and may not have considered their relationship to e-waste. By connecting gameplay choices to real environmental consequences</w:t>
-      </w:r>
-      <w:r>
-        <w:t xml:space="preserve"> </w:t>
-      </w:r>
-      <w:r>
-        <w:t>and grounding the experience in a real artwork</w:t>
-      </w:r>
-      <w:r>
-        <w:t xml:space="preserve">, </w:t>
-      </w:r>
-      <w:r>
-        <w:t>the game creates emotional proximity to a problem that is usually experienced as abstract.</w:t>
+      </w:pPr>
+      <w:r>
+        <w:rPr>
+          <w:i/>
+          <w:iCs/>
+        </w:rPr>
+        <w:t xml:space="preserve">What Remains? </w:t>
+      </w:r>
+      <w:r>
+        <w:t>is a narrative choices game that allows players to make a series of choices about the environment in which they play. These choices ultimately determine the health of the city in which the player plays, and which of three possible endings the player reaches after completing the game. This game is targeted towards students and young adults aged 16-28 who grew up with various electronic devices in their lives but did not necessarily consider their relationship with e-waste.</w:t>
       </w:r>
     </w:p>
     <w:p>
@@ -366,11 +373,13 @@
         <w:t xml:space="preserve">Oluwasemire Ajayi (25120111007): </w:t>
       </w:r>
       <w:r>
-        <w:t xml:space="preserve">Designed and implemented the SQLite database layer, Supabase leaderboard integration, authentication system using bcrypt, pygame-ce audio/input handling, splash screen UI, main application controller (main.py), signup handler, and </w:t>
-      </w:r>
-      <w:r>
-        <w:t>key bind</w:t>
-      </w:r>
+        <w:t xml:space="preserve">Designed and implemented the SQLite database, Supabase leaderboard integration, authentication system using bcrypt, pygame audio/input handling, splash screen UI, main application controller (main.py), signup handler, and </w:t>
+      </w:r>
+      <w:proofErr w:type="spellStart"/>
+      <w:r>
+        <w:t>keybind</w:t>
+      </w:r>
+      <w:proofErr w:type="spellEnd"/>
       <w:r>
         <w:t xml:space="preserve"> system.</w:t>
       </w:r>
@@ -514,15 +523,22 @@
         <w:t>Implemented pause screen and settings.py with key bind save/load functionality.</w:t>
       </w:r>
       <w:r>
-        <w:t xml:space="preserve"> Assisted in </w:t>
-      </w:r>
-      <w:proofErr w:type="spellStart"/>
-      <w:r>
-        <w:t>figma</w:t>
-      </w:r>
-      <w:proofErr w:type="spellEnd"/>
+        <w:t xml:space="preserve"> Assisted </w:t>
+      </w:r>
+      <w:r>
+        <w:t>with</w:t>
+      </w:r>
+      <w:r>
+        <w:t xml:space="preserve"> </w:t>
+      </w:r>
+      <w:r>
+        <w:t>Figma</w:t>
+      </w:r>
       <w:r>
         <w:t xml:space="preserve"> designs</w:t>
+      </w:r>
+      <w:r>
+        <w:t>.</w:t>
       </w:r>
     </w:p>
     <w:sectPr>

</xml_diff>

<commit_message>
Update one-pager document for improved clarity and engagement
</commit_message>
<xml_diff>
--- a/what-remains-one-pager.docx
+++ b/what-remains-one-pager.docx
@@ -132,8 +132,12 @@
         </w:numPr>
         <w:spacing w:after="40"/>
         <w:sectPr>
-          <w:headerReference w:type="default" r:id="rId7"/>
-          <w:footerReference w:type="default" r:id="rId8"/>
+          <w:headerReference w:type="even" r:id="rId7"/>
+          <w:headerReference w:type="default" r:id="rId8"/>
+          <w:footerReference w:type="even" r:id="rId9"/>
+          <w:footerReference w:type="default" r:id="rId10"/>
+          <w:headerReference w:type="first" r:id="rId11"/>
+          <w:footerReference w:type="first" r:id="rId12"/>
           <w:pgSz w:w="12240" w:h="15840"/>
           <w:pgMar w:top="1440" w:right="1440" w:bottom="1440" w:left="1440" w:header="708" w:footer="708" w:gutter="0"/>
           <w:cols w:space="720"/>
@@ -572,6 +576,16 @@
 </file>
 
 <file path=word/footer1.xml><?xml version="1.0" encoding="utf-8"?>
+<w:ftr xmlns:wpc="http://schemas.microsoft.com/office/word/2010/wordprocessingCanvas" xmlns:cx="http://schemas.microsoft.com/office/drawing/2014/chartex" xmlns:cx1="http://schemas.microsoft.com/office/drawing/2015/9/8/chartex" xmlns:cx2="http://schemas.microsoft.com/office/drawing/2015/10/21/chartex" xmlns:cx3="http://schemas.microsoft.com/office/drawing/2016/5/9/chartex" xmlns:cx4="http://schemas.microsoft.com/office/drawing/2016/5/10/chartex" xmlns:cx5="http://schemas.microsoft.com/office/drawing/2016/5/11/chartex" xmlns:cx6="http://schemas.microsoft.com/office/drawing/2016/5/12/chartex" xmlns:cx7="http://schemas.microsoft.com/office/drawing/2016/5/13/chartex" xmlns:cx8="http://schemas.microsoft.com/office/drawing/2016/5/14/chartex" xmlns:mc="http://schemas.openxmlformats.org/markup-compatibility/2006" xmlns:aink="http://schemas.microsoft.com/office/drawing/2016/ink" xmlns:am3d="http://schemas.microsoft.com/office/drawing/2017/model3d" xmlns:o="urn:schemas-microsoft-com:office:office" xmlns:oel="http://schemas.microsoft.com/office/2019/extlst" xmlns:r="http://schemas.openxmlformats.org/officeDocument/2006/relationships" xmlns:m="http://schemas.openxmlformats.org/officeDocument/2006/math" xmlns:v="urn:schemas-microsoft-com:vml" xmlns:wp14="http://schemas.microsoft.com/office/word/2010/wordprocessingDrawing" xmlns:wp="http://schemas.openxmlformats.org/drawingml/2006/wordprocessingDrawing" xmlns:w10="urn:schemas-microsoft-com:office:word" xmlns:w="http://schemas.openxmlformats.org/wordprocessingml/2006/main" xmlns:w14="http://schemas.microsoft.com/office/word/2010/wordml" xmlns:w15="http://schemas.microsoft.com/office/word/2012/wordml" xmlns:w16cex="http://schemas.microsoft.com/office/word/2018/wordml/cex" xmlns:w16cid="http://schemas.microsoft.com/office/word/2016/wordml/cid" xmlns:w16="http://schemas.microsoft.com/office/word/2018/wordml" xmlns:w16du="http://schemas.microsoft.com/office/word/2023/wordml/word16du" xmlns:w16sdtdh="http://schemas.microsoft.com/office/word/2020/wordml/sdtdatahash" xmlns:w16sdtfl="http://schemas.microsoft.com/office/word/2024/wordml/sdtformatlock" xmlns:w16se="http://schemas.microsoft.com/office/word/2015/wordml/symex" xmlns:wpg="http://schemas.microsoft.com/office/word/2010/wordprocessingGroup" xmlns:wpi="http://schemas.microsoft.com/office/word/2010/wordprocessingInk" xmlns:wne="http://schemas.microsoft.com/office/word/2006/wordml" xmlns:wps="http://schemas.microsoft.com/office/word/2010/wordprocessingShape" mc:Ignorable="w14 w15 w16se w16cid w16 w16cex w16sdtdh w16sdtfl w16du wp14">
+  <w:p>
+    <w:pPr>
+      <w:pStyle w:val="Footer"/>
+    </w:pPr>
+  </w:p>
+</w:ftr>
+</file>
+
+<file path=word/footer2.xml><?xml version="1.0" encoding="utf-8"?>
 <w:ftr xmlns:wpc="http://schemas.microsoft.com/office/word/2010/wordprocessingCanvas" xmlns:cx="http://schemas.microsoft.com/office/drawing/2014/chartex" xmlns:cx1="http://schemas.microsoft.com/office/drawing/2015/9/8/chartex" xmlns:cx2="http://schemas.microsoft.com/office/drawing/2015/10/21/chartex" xmlns:cx3="http://schemas.microsoft.com/office/drawing/2016/5/9/chartex" xmlns:cx4="http://schemas.microsoft.com/office/drawing/2016/5/10/chartex" xmlns:cx5="http://schemas.microsoft.com/office/drawing/2016/5/11/chartex" xmlns:cx6="http://schemas.microsoft.com/office/drawing/2016/5/12/chartex" xmlns:cx7="http://schemas.microsoft.com/office/drawing/2016/5/13/chartex" xmlns:cx8="http://schemas.microsoft.com/office/drawing/2016/5/14/chartex" xmlns:mc="http://schemas.openxmlformats.org/markup-compatibility/2006" xmlns:aink="http://schemas.microsoft.com/office/drawing/2016/ink" xmlns:am3d="http://schemas.microsoft.com/office/drawing/2017/model3d" xmlns:o="urn:schemas-microsoft-com:office:office" xmlns:oel="http://schemas.microsoft.com/office/2019/extlst" xmlns:r="http://schemas.openxmlformats.org/officeDocument/2006/relationships" xmlns:m="http://schemas.openxmlformats.org/officeDocument/2006/math" xmlns:v="urn:schemas-microsoft-com:vml" xmlns:wp14="http://schemas.microsoft.com/office/word/2010/wordprocessingDrawing" xmlns:wp="http://schemas.openxmlformats.org/drawingml/2006/wordprocessingDrawing" xmlns:w10="urn:schemas-microsoft-com:office:word" xmlns:w="http://schemas.openxmlformats.org/wordprocessingml/2006/main" xmlns:w14="http://schemas.microsoft.com/office/word/2010/wordml" xmlns:w15="http://schemas.microsoft.com/office/word/2012/wordml" xmlns:w16cex="http://schemas.microsoft.com/office/word/2018/wordml/cex" xmlns:w16cid="http://schemas.microsoft.com/office/word/2016/wordml/cid" xmlns:w16="http://schemas.microsoft.com/office/word/2018/wordml" xmlns:w16du="http://schemas.microsoft.com/office/word/2023/wordml/word16du" xmlns:w16sdtdh="http://schemas.microsoft.com/office/word/2020/wordml/sdtdatahash" xmlns:w16sdtfl="http://schemas.microsoft.com/office/word/2024/wordml/sdtformatlock" xmlns:w16se="http://schemas.microsoft.com/office/word/2015/wordml/symex" xmlns:wpg="http://schemas.microsoft.com/office/word/2010/wordprocessingGroup" xmlns:wpi="http://schemas.microsoft.com/office/word/2010/wordprocessingInk" xmlns:wne="http://schemas.microsoft.com/office/word/2006/wordml" xmlns:wps="http://schemas.microsoft.com/office/word/2010/wordprocessingShape" mc:Ignorable="w14 w15 w16se w16cid w16 w16cex w16sdtdh w16sdtfl w16du wp14">
   <w:p>
     <w:pPr>
@@ -589,9 +603,14 @@
     <w:pPr>
       <w:spacing w:after="80"/>
     </w:pPr>
-    <w:r>
-      <w:t>https://github.com/serenebliss0/Group-1</w:t>
-    </w:r>
+    <w:hyperlink r:id="rId1" w:history="1">
+      <w:r>
+        <w:rPr>
+          <w:rStyle w:val="Hyperlink"/>
+        </w:rPr>
+        <w:t>https://github.com/serenebliss0/Group-1</w:t>
+      </w:r>
+    </w:hyperlink>
   </w:p>
   <w:p>
     <w:pPr>
@@ -616,6 +635,16 @@
 </w:ftr>
 </file>
 
+<file path=word/footer3.xml><?xml version="1.0" encoding="utf-8"?>
+<w:ftr xmlns:wpc="http://schemas.microsoft.com/office/word/2010/wordprocessingCanvas" xmlns:cx="http://schemas.microsoft.com/office/drawing/2014/chartex" xmlns:cx1="http://schemas.microsoft.com/office/drawing/2015/9/8/chartex" xmlns:cx2="http://schemas.microsoft.com/office/drawing/2015/10/21/chartex" xmlns:cx3="http://schemas.microsoft.com/office/drawing/2016/5/9/chartex" xmlns:cx4="http://schemas.microsoft.com/office/drawing/2016/5/10/chartex" xmlns:cx5="http://schemas.microsoft.com/office/drawing/2016/5/11/chartex" xmlns:cx6="http://schemas.microsoft.com/office/drawing/2016/5/12/chartex" xmlns:cx7="http://schemas.microsoft.com/office/drawing/2016/5/13/chartex" xmlns:cx8="http://schemas.microsoft.com/office/drawing/2016/5/14/chartex" xmlns:mc="http://schemas.openxmlformats.org/markup-compatibility/2006" xmlns:aink="http://schemas.microsoft.com/office/drawing/2016/ink" xmlns:am3d="http://schemas.microsoft.com/office/drawing/2017/model3d" xmlns:o="urn:schemas-microsoft-com:office:office" xmlns:oel="http://schemas.microsoft.com/office/2019/extlst" xmlns:r="http://schemas.openxmlformats.org/officeDocument/2006/relationships" xmlns:m="http://schemas.openxmlformats.org/officeDocument/2006/math" xmlns:v="urn:schemas-microsoft-com:vml" xmlns:wp14="http://schemas.microsoft.com/office/word/2010/wordprocessingDrawing" xmlns:wp="http://schemas.openxmlformats.org/drawingml/2006/wordprocessingDrawing" xmlns:w10="urn:schemas-microsoft-com:office:word" xmlns:w="http://schemas.openxmlformats.org/wordprocessingml/2006/main" xmlns:w14="http://schemas.microsoft.com/office/word/2010/wordml" xmlns:w15="http://schemas.microsoft.com/office/word/2012/wordml" xmlns:w16cex="http://schemas.microsoft.com/office/word/2018/wordml/cex" xmlns:w16cid="http://schemas.microsoft.com/office/word/2016/wordml/cid" xmlns:w16="http://schemas.microsoft.com/office/word/2018/wordml" xmlns:w16du="http://schemas.microsoft.com/office/word/2023/wordml/word16du" xmlns:w16sdtdh="http://schemas.microsoft.com/office/word/2020/wordml/sdtdatahash" xmlns:w16sdtfl="http://schemas.microsoft.com/office/word/2024/wordml/sdtformatlock" xmlns:w16se="http://schemas.microsoft.com/office/word/2015/wordml/symex" xmlns:wpg="http://schemas.microsoft.com/office/word/2010/wordprocessingGroup" xmlns:wpi="http://schemas.microsoft.com/office/word/2010/wordprocessingInk" xmlns:wne="http://schemas.microsoft.com/office/word/2006/wordml" xmlns:wps="http://schemas.microsoft.com/office/word/2010/wordprocessingShape" mc:Ignorable="w14 w15 w16se w16cid w16 w16cex w16sdtdh w16sdtfl w16du wp14">
+  <w:p>
+    <w:pPr>
+      <w:pStyle w:val="Footer"/>
+    </w:pPr>
+  </w:p>
+</w:ftr>
+</file>
+
 <file path=word/footnotes.xml><?xml version="1.0" encoding="utf-8"?>
 <w:footnotes xmlns:wpc="http://schemas.microsoft.com/office/word/2010/wordprocessingCanvas" xmlns:cx="http://schemas.microsoft.com/office/drawing/2014/chartex" xmlns:cx1="http://schemas.microsoft.com/office/drawing/2015/9/8/chartex" xmlns:cx2="http://schemas.microsoft.com/office/drawing/2015/10/21/chartex" xmlns:cx3="http://schemas.microsoft.com/office/drawing/2016/5/9/chartex" xmlns:cx4="http://schemas.microsoft.com/office/drawing/2016/5/10/chartex" xmlns:cx5="http://schemas.microsoft.com/office/drawing/2016/5/11/chartex" xmlns:cx6="http://schemas.microsoft.com/office/drawing/2016/5/12/chartex" xmlns:cx7="http://schemas.microsoft.com/office/drawing/2016/5/13/chartex" xmlns:cx8="http://schemas.microsoft.com/office/drawing/2016/5/14/chartex" xmlns:mc="http://schemas.openxmlformats.org/markup-compatibility/2006" xmlns:aink="http://schemas.microsoft.com/office/drawing/2016/ink" xmlns:am3d="http://schemas.microsoft.com/office/drawing/2017/model3d" xmlns:o="urn:schemas-microsoft-com:office:office" xmlns:oel="http://schemas.microsoft.com/office/2019/extlst" xmlns:r="http://schemas.openxmlformats.org/officeDocument/2006/relationships" xmlns:m="http://schemas.openxmlformats.org/officeDocument/2006/math" xmlns:v="urn:schemas-microsoft-com:vml" xmlns:wp14="http://schemas.microsoft.com/office/word/2010/wordprocessingDrawing" xmlns:wp="http://schemas.openxmlformats.org/drawingml/2006/wordprocessingDrawing" xmlns:w10="urn:schemas-microsoft-com:office:word" xmlns:w="http://schemas.openxmlformats.org/wordprocessingml/2006/main" xmlns:w14="http://schemas.microsoft.com/office/word/2010/wordml" xmlns:w15="http://schemas.microsoft.com/office/word/2012/wordml" xmlns:w16cex="http://schemas.microsoft.com/office/word/2018/wordml/cex" xmlns:w16cid="http://schemas.microsoft.com/office/word/2016/wordml/cid" xmlns:w16="http://schemas.microsoft.com/office/word/2018/wordml" xmlns:w16du="http://schemas.microsoft.com/office/word/2023/wordml/word16du" xmlns:w16sdtdh="http://schemas.microsoft.com/office/word/2020/wordml/sdtdatahash" xmlns:w16sdtfl="http://schemas.microsoft.com/office/word/2024/wordml/sdtformatlock" xmlns:w16se="http://schemas.microsoft.com/office/word/2015/wordml/symex" xmlns:wpg="http://schemas.microsoft.com/office/word/2010/wordprocessingGroup" xmlns:wpi="http://schemas.microsoft.com/office/word/2010/wordprocessingInk" xmlns:wne="http://schemas.microsoft.com/office/word/2006/wordml" xmlns:wps="http://schemas.microsoft.com/office/word/2010/wordprocessingShape" mc:Ignorable="w14 w15 w16se w16cid w16 w16cex w16sdtdh w16sdtfl w16du wp14">
   <w:footnote w:type="separator" w:id="-1">
@@ -636,6 +665,16 @@
 </file>
 
 <file path=word/header1.xml><?xml version="1.0" encoding="utf-8"?>
+<w:hdr xmlns:wpc="http://schemas.microsoft.com/office/word/2010/wordprocessingCanvas" xmlns:cx="http://schemas.microsoft.com/office/drawing/2014/chartex" xmlns:cx1="http://schemas.microsoft.com/office/drawing/2015/9/8/chartex" xmlns:cx2="http://schemas.microsoft.com/office/drawing/2015/10/21/chartex" xmlns:cx3="http://schemas.microsoft.com/office/drawing/2016/5/9/chartex" xmlns:cx4="http://schemas.microsoft.com/office/drawing/2016/5/10/chartex" xmlns:cx5="http://schemas.microsoft.com/office/drawing/2016/5/11/chartex" xmlns:cx6="http://schemas.microsoft.com/office/drawing/2016/5/12/chartex" xmlns:cx7="http://schemas.microsoft.com/office/drawing/2016/5/13/chartex" xmlns:cx8="http://schemas.microsoft.com/office/drawing/2016/5/14/chartex" xmlns:mc="http://schemas.openxmlformats.org/markup-compatibility/2006" xmlns:aink="http://schemas.microsoft.com/office/drawing/2016/ink" xmlns:am3d="http://schemas.microsoft.com/office/drawing/2017/model3d" xmlns:o="urn:schemas-microsoft-com:office:office" xmlns:oel="http://schemas.microsoft.com/office/2019/extlst" xmlns:r="http://schemas.openxmlformats.org/officeDocument/2006/relationships" xmlns:m="http://schemas.openxmlformats.org/officeDocument/2006/math" xmlns:v="urn:schemas-microsoft-com:vml" xmlns:wp14="http://schemas.microsoft.com/office/word/2010/wordprocessingDrawing" xmlns:wp="http://schemas.openxmlformats.org/drawingml/2006/wordprocessingDrawing" xmlns:w10="urn:schemas-microsoft-com:office:word" xmlns:w="http://schemas.openxmlformats.org/wordprocessingml/2006/main" xmlns:w14="http://schemas.microsoft.com/office/word/2010/wordml" xmlns:w15="http://schemas.microsoft.com/office/word/2012/wordml" xmlns:w16cex="http://schemas.microsoft.com/office/word/2018/wordml/cex" xmlns:w16cid="http://schemas.microsoft.com/office/word/2016/wordml/cid" xmlns:w16="http://schemas.microsoft.com/office/word/2018/wordml" xmlns:w16du="http://schemas.microsoft.com/office/word/2023/wordml/word16du" xmlns:w16sdtdh="http://schemas.microsoft.com/office/word/2020/wordml/sdtdatahash" xmlns:w16sdtfl="http://schemas.microsoft.com/office/word/2024/wordml/sdtformatlock" xmlns:w16se="http://schemas.microsoft.com/office/word/2015/wordml/symex" xmlns:wpg="http://schemas.microsoft.com/office/word/2010/wordprocessingGroup" xmlns:wpi="http://schemas.microsoft.com/office/word/2010/wordprocessingInk" xmlns:wne="http://schemas.microsoft.com/office/word/2006/wordml" xmlns:wps="http://schemas.microsoft.com/office/word/2010/wordprocessingShape" mc:Ignorable="w14 w15 w16se w16cid w16 w16cex w16sdtdh w16sdtfl w16du wp14">
+  <w:p>
+    <w:pPr>
+      <w:pStyle w:val="Header"/>
+    </w:pPr>
+  </w:p>
+</w:hdr>
+</file>
+
+<file path=word/header2.xml><?xml version="1.0" encoding="utf-8"?>
 <w:hdr xmlns:wpc="http://schemas.microsoft.com/office/word/2010/wordprocessingCanvas" xmlns:cx="http://schemas.microsoft.com/office/drawing/2014/chartex" xmlns:cx1="http://schemas.microsoft.com/office/drawing/2015/9/8/chartex" xmlns:cx2="http://schemas.microsoft.com/office/drawing/2015/10/21/chartex" xmlns:cx3="http://schemas.microsoft.com/office/drawing/2016/5/9/chartex" xmlns:cx4="http://schemas.microsoft.com/office/drawing/2016/5/10/chartex" xmlns:cx5="http://schemas.microsoft.com/office/drawing/2016/5/11/chartex" xmlns:cx6="http://schemas.microsoft.com/office/drawing/2016/5/12/chartex" xmlns:cx7="http://schemas.microsoft.com/office/drawing/2016/5/13/chartex" xmlns:cx8="http://schemas.microsoft.com/office/drawing/2016/5/14/chartex" xmlns:mc="http://schemas.openxmlformats.org/markup-compatibility/2006" xmlns:aink="http://schemas.microsoft.com/office/drawing/2016/ink" xmlns:am3d="http://schemas.microsoft.com/office/drawing/2017/model3d" xmlns:o="urn:schemas-microsoft-com:office:office" xmlns:oel="http://schemas.microsoft.com/office/2019/extlst" xmlns:r="http://schemas.openxmlformats.org/officeDocument/2006/relationships" xmlns:m="http://schemas.openxmlformats.org/officeDocument/2006/math" xmlns:v="urn:schemas-microsoft-com:vml" xmlns:wp14="http://schemas.microsoft.com/office/word/2010/wordprocessingDrawing" xmlns:wp="http://schemas.openxmlformats.org/drawingml/2006/wordprocessingDrawing" xmlns:w10="urn:schemas-microsoft-com:office:word" xmlns:w="http://schemas.openxmlformats.org/wordprocessingml/2006/main" xmlns:w14="http://schemas.microsoft.com/office/word/2010/wordml" xmlns:w15="http://schemas.microsoft.com/office/word/2012/wordml" xmlns:w16cex="http://schemas.microsoft.com/office/word/2018/wordml/cex" xmlns:w16cid="http://schemas.microsoft.com/office/word/2016/wordml/cid" xmlns:w16="http://schemas.microsoft.com/office/word/2018/wordml" xmlns:w16du="http://schemas.microsoft.com/office/word/2023/wordml/word16du" xmlns:w16sdtdh="http://schemas.microsoft.com/office/word/2020/wordml/sdtdatahash" xmlns:w16sdtfl="http://schemas.microsoft.com/office/word/2024/wordml/sdtformatlock" xmlns:w16se="http://schemas.microsoft.com/office/word/2015/wordml/symex" xmlns:wpg="http://schemas.microsoft.com/office/word/2010/wordprocessingGroup" xmlns:wpi="http://schemas.microsoft.com/office/word/2010/wordprocessingInk" xmlns:wne="http://schemas.microsoft.com/office/word/2006/wordml" xmlns:wps="http://schemas.microsoft.com/office/word/2010/wordprocessingShape" mc:Ignorable="w14 w15 w16se w16cid w16 w16cex w16sdtdh w16sdtfl w16du wp14">
   <w:p>
     <w:pPr>
@@ -680,6 +719,16 @@
       </w:rPr>
       <w:t>COS 102: Introduction to Problem Solving · Group 1 · Pan-Atlantic University · 2025/2026</w:t>
     </w:r>
+  </w:p>
+</w:hdr>
+</file>
+
+<file path=word/header3.xml><?xml version="1.0" encoding="utf-8"?>
+<w:hdr xmlns:wpc="http://schemas.microsoft.com/office/word/2010/wordprocessingCanvas" xmlns:cx="http://schemas.microsoft.com/office/drawing/2014/chartex" xmlns:cx1="http://schemas.microsoft.com/office/drawing/2015/9/8/chartex" xmlns:cx2="http://schemas.microsoft.com/office/drawing/2015/10/21/chartex" xmlns:cx3="http://schemas.microsoft.com/office/drawing/2016/5/9/chartex" xmlns:cx4="http://schemas.microsoft.com/office/drawing/2016/5/10/chartex" xmlns:cx5="http://schemas.microsoft.com/office/drawing/2016/5/11/chartex" xmlns:cx6="http://schemas.microsoft.com/office/drawing/2016/5/12/chartex" xmlns:cx7="http://schemas.microsoft.com/office/drawing/2016/5/13/chartex" xmlns:cx8="http://schemas.microsoft.com/office/drawing/2016/5/14/chartex" xmlns:mc="http://schemas.openxmlformats.org/markup-compatibility/2006" xmlns:aink="http://schemas.microsoft.com/office/drawing/2016/ink" xmlns:am3d="http://schemas.microsoft.com/office/drawing/2017/model3d" xmlns:o="urn:schemas-microsoft-com:office:office" xmlns:oel="http://schemas.microsoft.com/office/2019/extlst" xmlns:r="http://schemas.openxmlformats.org/officeDocument/2006/relationships" xmlns:m="http://schemas.openxmlformats.org/officeDocument/2006/math" xmlns:v="urn:schemas-microsoft-com:vml" xmlns:wp14="http://schemas.microsoft.com/office/word/2010/wordprocessingDrawing" xmlns:wp="http://schemas.openxmlformats.org/drawingml/2006/wordprocessingDrawing" xmlns:w10="urn:schemas-microsoft-com:office:word" xmlns:w="http://schemas.openxmlformats.org/wordprocessingml/2006/main" xmlns:w14="http://schemas.microsoft.com/office/word/2010/wordml" xmlns:w15="http://schemas.microsoft.com/office/word/2012/wordml" xmlns:w16cex="http://schemas.microsoft.com/office/word/2018/wordml/cex" xmlns:w16cid="http://schemas.microsoft.com/office/word/2016/wordml/cid" xmlns:w16="http://schemas.microsoft.com/office/word/2018/wordml" xmlns:w16du="http://schemas.microsoft.com/office/word/2023/wordml/word16du" xmlns:w16sdtdh="http://schemas.microsoft.com/office/word/2020/wordml/sdtdatahash" xmlns:w16sdtfl="http://schemas.microsoft.com/office/word/2024/wordml/sdtformatlock" xmlns:w16se="http://schemas.microsoft.com/office/word/2015/wordml/symex" xmlns:wpg="http://schemas.microsoft.com/office/word/2010/wordprocessingGroup" xmlns:wpi="http://schemas.microsoft.com/office/word/2010/wordprocessingInk" xmlns:wne="http://schemas.microsoft.com/office/word/2006/wordml" xmlns:wps="http://schemas.microsoft.com/office/word/2010/wordprocessingShape" mc:Ignorable="w14 w15 w16se w16cid w16 w16cex w16sdtdh w16sdtfl w16du wp14">
+  <w:p>
+    <w:pPr>
+      <w:pStyle w:val="Header"/>
+    </w:pPr>
   </w:p>
 </w:hdr>
 </file>
@@ -840,15 +889,6 @@
   </w:num>
   <w:num w:numId="3" w16cid:durableId="1608343302">
     <w:abstractNumId w:val="0"/>
-    <w:lvlOverride w:ilvl="0"/>
-    <w:lvlOverride w:ilvl="1"/>
-    <w:lvlOverride w:ilvl="2"/>
-    <w:lvlOverride w:ilvl="3"/>
-    <w:lvlOverride w:ilvl="4"/>
-    <w:lvlOverride w:ilvl="5"/>
-    <w:lvlOverride w:ilvl="6"/>
-    <w:lvlOverride w:ilvl="7"/>
-    <w:lvlOverride w:ilvl="8"/>
   </w:num>
 </w:numbering>
 </file>
@@ -1336,6 +1376,7 @@
   <w:style w:type="character" w:default="1" w:styleId="DefaultParagraphFont">
     <w:name w:val="Default Paragraph Font"/>
     <w:uiPriority w:val="1"/>
+    <w:semiHidden/>
     <w:unhideWhenUsed/>
   </w:style>
   <w:style w:type="table" w:default="1" w:styleId="TableNormal">

</xml_diff>